<commit_message>
Convert CP8 reviews to markdown
</commit_message>
<xml_diff>
--- a/images/HW7/G6_Final_Review.docx
+++ b/images/HW7/G6_Final_Review.docx
@@ -155,6 +155,15 @@
                 <w:szCs w:val="20"/>
               </w:rPr>
             </w:pPr>
+            <w:r>
+              <w:rPr>
+                <w:rFonts w:ascii="Times New Roman" w:eastAsia="Times New Roman" w:hAnsi="Times New Roman" w:cs="Times New Roman"/>
+                <w:b/>
+                <w:sz w:val="20"/>
+                <w:szCs w:val="20"/>
+              </w:rPr>
+              <w:t>4/22/2026</w:t>
+            </w:r>
           </w:p>
         </w:tc>
       </w:tr>
@@ -234,7 +243,7 @@
                 <w:sz w:val="20"/>
                 <w:szCs w:val="20"/>
               </w:rPr>
-              <w:t xml:space="preserve"> </w:t>
+              <w:t>G6</w:t>
             </w:r>
           </w:p>
         </w:tc>
@@ -312,7 +321,7 @@
                 <w:sz w:val="20"/>
                 <w:szCs w:val="20"/>
               </w:rPr>
-              <w:t xml:space="preserve"> </w:t>
+              <w:t>G2</w:t>
             </w:r>
           </w:p>
         </w:tc>

</xml_diff>